<commit_message>
Fix CI portability: pool sizing args are Postgres-only
Under CI DATABASE_URL=sqlite+aiosqlite:///:memory: the engine's
pool_size/max_overflow hit StaticPool and crash at import, so the CI
backend job could never run. Verified: full suite passes under the
exact CI environment (38 passed). Regenerated AUDIT_WORKING_DOCUMENT.docx.
</commit_message>
<xml_diff>
--- a/AUDIT_WORKING_DOCUMENT.docx
+++ b/AUDIT_WORKING_DOCUMENT.docx
@@ -4537,6 +4537,57 @@
         <w:rPr>
           <w:b/>
         </w:rPr>
+        <w:t>Post-tier CI portability fix</w:t>
+      </w:r>
+      <w:r>
+        <w:t xml:space="preserve"> — the app engine passed </w:t>
+      </w:r>
+      <w:r>
+        <w:rPr>
+          <w:rFonts w:ascii="Consolas" w:hAnsi="Consolas"/>
+          <w:sz w:val="19"/>
+        </w:rPr>
+        <w:t>pool_size</w:t>
+      </w:r>
+      <w:r>
+        <w:t>/</w:t>
+      </w:r>
+      <w:r>
+        <w:rPr>
+          <w:rFonts w:ascii="Consolas" w:hAnsi="Consolas"/>
+          <w:sz w:val="19"/>
+        </w:rPr>
+        <w:t>max_overflow</w:t>
+      </w:r>
+      <w:r>
+        <w:t xml:space="preserve"> unconditionally; under CI's sqlite </w:t>
+      </w:r>
+      <w:r>
+        <w:rPr>
+          <w:rFonts w:ascii="Consolas" w:hAnsi="Consolas"/>
+          <w:sz w:val="19"/>
+        </w:rPr>
+        <w:t>DATABASE_URL</w:t>
+      </w:r>
+      <w:r>
+        <w:t xml:space="preserve"> those args hit StaticPool and crash at import (CI's backend job could never have run the tests). Pool args are now Postgres-only (database.py). Suite re-verified under the exact CI environment (</w:t>
+      </w:r>
+      <w:r>
+        <w:rPr>
+          <w:rFonts w:ascii="Consolas" w:hAnsi="Consolas"/>
+          <w:sz w:val="19"/>
+        </w:rPr>
+        <w:t>DATABASE_URL=sqlite+aiosqlite:///:memory:</w:t>
+      </w:r>
+      <w:r>
+        <w:t>): 38 passed.</w:t>
+      </w:r>
+    </w:p>
+    <w:p>
+      <w:r>
+        <w:rPr>
+          <w:b/>
+        </w:rPr>
         <w:t>Final verification (all commands run 3 July 2026):</w:t>
       </w:r>
     </w:p>
@@ -4561,7 +4612,7 @@
         <w:t>38 passed, 0 failed</w:t>
       </w:r>
       <w:r>
-        <w:t xml:space="preserve"> (was 6F/15P/5E)</w:t>
+        <w:t xml:space="preserve"> (was 6F/15P/5E), including a run under CI's exact env</w:t>
       </w:r>
     </w:p>
     <w:p>

</xml_diff>